<commit_message>
fix: narrow occurrence-unique label+value entries to preserve label formatting, keep repeated-value entries anchored
</commit_message>
<xml_diff>
--- a/01. Hồ sơ đạo đức đề cương - MẪU/02. BB họp HĐ đạo đức.docx
+++ b/01. Hồ sơ đạo đức đề cương - MẪU/02. BB họp HĐ đạo đức.docx
@@ -806,7 +806,45 @@
           <w:sz w:val="28"/>
           <w:lang w:val="fr-FR"/>
         </w:rPr>
-        <w:t>Chủ nhiệm đề tài: {{CHU_NHIEM_HO_TEN}}</w:t>
+        <w:t>Chủ nhiệm</w:t>
+      </w:r>
+      <w:r>
+        <w:rPr>
+          <w:rFonts w:ascii="Times New Roman" w:hAnsi="Times New Roman"/>
+          <w:b/>
+          <w:iCs/>
+          <w:sz w:val="28"/>
+        </w:rPr>
+        <w:t xml:space="preserve"> đề tài</w:t>
+      </w:r>
+      <w:r>
+        <w:rPr>
+          <w:rFonts w:ascii="Times New Roman" w:hAnsi="Times New Roman"/>
+          <w:b/>
+          <w:iCs/>
+          <w:sz w:val="28"/>
+          <w:lang w:val="fr-FR"/>
+        </w:rPr>
+        <w:t>:</w:t>
+      </w:r>
+      <w:r>
+        <w:rPr>
+          <w:rFonts w:ascii="Times New Roman" w:hAnsi="Times New Roman"/>
+          <w:bCs/>
+          <w:iCs/>
+          <w:sz w:val="28"/>
+        </w:rPr>
+        <w:t xml:space="preserve"> </w:t>
+      </w:r>
+      <w:r>
+        <w:rPr>
+          <w:rFonts w:ascii="Times New Roman" w:hAnsi="Times New Roman"/>
+          <w:bCs/>
+          <w:iCs/>
+          <w:sz w:val="28"/>
+          <w:lang w:val="fr-FR"/>
+        </w:rPr>
+        <w:t>{{CHU_NHIEM_HO_TEN}}</w:t>
       </w:r>
     </w:p>
     <w:p>

</xml_diff>